<commit_message>
Se realiza tabla dinamica referente a la entrega de oficios
</commit_message>
<xml_diff>
--- a/output_abogados/Ana_Maria_Guzman_Acosta/WORDS/aviso/OFICIO_75340_CONSTRUCTORA_ALFUTURO_S.A.docx
+++ b/output_abogados/Ana_Maria_Guzman_Acosta/WORDS/aviso/OFICIO_75340_CONSTRUCTORA_ALFUTURO_S.A.docx
@@ -188,6 +188,18 @@
         </w:rPr>
         <w:t>NOTIFICACION POR AVISO</w:t>
       </w:r>
+    </w:p>
+    <w:p>
+      <w:pPr>
+        <w:pStyle w:val="Sinespaciado"/>
+        <w:rPr>
+          <w:rFonts w:ascii="Arial" w:hAnsi="Arial" w:cs="Arial"/>
+          <w:b/>
+          <w:bCs/>
+          <w:sz w:val="24"/>
+          <w:szCs w:val="24"/>
+        </w:rPr>
+      </w:pPr>
     </w:p>
     <w:p>
       <w:pPr>

</xml_diff>